<commit_message>
adding chapter 5 hands on notebook and HW4 Savage files, HW5 pdf
</commit_message>
<xml_diff>
--- a/assignments/FIN220_HW4_Savage.docx
+++ b/assignments/FIN220_HW4_Savage.docx
@@ -17,6 +17,9 @@
       <w:r>
         <w:t>HW4</w:t>
       </w:r>
+      <w:r>
+        <w:t xml:space="preserve"> – Daniel Savage</w:t>
+      </w:r>
     </w:p>
     <w:p>
       <w:pPr>
@@ -57,7 +60,15 @@
         <w:jc w:val="both"/>
       </w:pPr>
       <w:r>
-        <w:t>Most likely the model is overfitting. “the hallmark of overfitting the model”</w:t>
+        <w:t>Most likely the model is overfitting. “</w:t>
+      </w:r>
+      <w:proofErr w:type="gramStart"/>
+      <w:r>
+        <w:t>the</w:t>
+      </w:r>
+      <w:proofErr w:type="gramEnd"/>
+      <w:r>
+        <w:t xml:space="preserve"> hallmark of overfitting the model”</w:t>
       </w:r>
     </w:p>
     <w:p>
@@ -130,7 +141,15 @@
         <w:t>. I’m assuming that</w:t>
       </w:r>
       <w:r>
-        <w:t xml:space="preserve"> these topics are subsequent to this question.</w:t>
+        <w:t xml:space="preserve"> these topics are </w:t>
+      </w:r>
+      <w:proofErr w:type="gramStart"/>
+      <w:r>
+        <w:t>subsequent to</w:t>
+      </w:r>
+      <w:proofErr w:type="gramEnd"/>
+      <w:r>
+        <w:t xml:space="preserve"> this question.</w:t>
       </w:r>
     </w:p>
     <w:p>
@@ -162,7 +181,15 @@
         <w:t>regression,</w:t>
       </w:r>
       <w:r>
-        <w:t xml:space="preserve"> and you notice that the training error and the validation error are almost equal and fairly high. </w:t>
+        <w:t xml:space="preserve"> and you notice that the training error and the validation error are almost equal and </w:t>
+      </w:r>
+      <w:proofErr w:type="gramStart"/>
+      <w:r>
+        <w:t>fairly high</w:t>
+      </w:r>
+      <w:proofErr w:type="gramEnd"/>
+      <w:r>
+        <w:t xml:space="preserve">. </w:t>
       </w:r>
     </w:p>
     <w:p>
@@ -219,23 +246,55 @@
           <w:b/>
           <w:bCs/>
         </w:rPr>
-        <w:t>Should you increase the regularization hyperparameter or reduce it?</w:t>
-      </w:r>
-    </w:p>
-    <w:p>
-      <w:pPr>
-        <w:jc w:val="both"/>
-      </w:pPr>
-      <w:r>
-        <w:t>Reduce the regularization hyperparameter.</w:t>
-      </w:r>
-    </w:p>
-    <w:p>
-      <w:pPr>
-        <w:jc w:val="both"/>
-      </w:pPr>
-      <w:r>
-        <w:t xml:space="preserve">Reducing the regularization hyperparameter, with a polynomial model will, in effect, </w:t>
+        <w:t xml:space="preserve">Should you increase the </w:t>
+      </w:r>
+      <w:proofErr w:type="gramStart"/>
+      <w:r>
+        <w:rPr>
+          <w:b/>
+          <w:bCs/>
+        </w:rPr>
+        <w:t>regularization</w:t>
+      </w:r>
+      <w:proofErr w:type="gramEnd"/>
+      <w:r>
+        <w:rPr>
+          <w:b/>
+          <w:bCs/>
+        </w:rPr>
+        <w:t xml:space="preserve"> hyperparameter or reduce it?</w:t>
+      </w:r>
+    </w:p>
+    <w:p>
+      <w:pPr>
+        <w:jc w:val="both"/>
+      </w:pPr>
+      <w:r>
+        <w:t xml:space="preserve">Reduce the </w:t>
+      </w:r>
+      <w:proofErr w:type="gramStart"/>
+      <w:r>
+        <w:t>regularization hyperparameter</w:t>
+      </w:r>
+      <w:proofErr w:type="gramEnd"/>
+      <w:r>
+        <w:t>.</w:t>
+      </w:r>
+    </w:p>
+    <w:p>
+      <w:pPr>
+        <w:jc w:val="both"/>
+      </w:pPr>
+      <w:r>
+        <w:t xml:space="preserve">Reducing the </w:t>
+      </w:r>
+      <w:proofErr w:type="gramStart"/>
+      <w:r>
+        <w:t>regularization</w:t>
+      </w:r>
+      <w:proofErr w:type="gramEnd"/>
+      <w:r>
+        <w:t xml:space="preserve"> hyperparameter, with a polynomial model will, in effect, </w:t>
       </w:r>
       <w:r>
         <w:t xml:space="preserve">also </w:t>

</xml_diff>

<commit_message>
Added Chapter 7, 8, and 9 notebooks and final project PDF
</commit_message>
<xml_diff>
--- a/assignments/FIN220_HW4_Savage.docx
+++ b/assignments/FIN220_HW4_Savage.docx
@@ -31,13 +31,7 @@
         <w:jc w:val="both"/>
       </w:pPr>
       <w:r>
-        <w:t xml:space="preserve">Suppose you are using polynomial regression. You plot the learning </w:t>
-      </w:r>
-      <w:r>
-        <w:t>curves,</w:t>
-      </w:r>
-      <w:r>
-        <w:t xml:space="preserve"> and you notice that there is a large gap between the training error and the validation error.</w:t>
+        <w:t>Suppose you are using polynomial regression. You plot the learning curves, and you notice that there is a large gap between the training error and the validation error.</w:t>
       </w:r>
     </w:p>
     <w:p>
@@ -175,13 +169,7 @@
         <w:t xml:space="preserve">2) </w:t>
       </w:r>
       <w:r>
-        <w:t xml:space="preserve">Suppose you are using ridge </w:t>
-      </w:r>
-      <w:r>
-        <w:t>regression,</w:t>
-      </w:r>
-      <w:r>
-        <w:t xml:space="preserve"> and you notice that the training error and the validation error are almost equal and </w:t>
+        <w:t xml:space="preserve">Suppose you are using ridge regression, and you notice that the training error and the validation error are almost equal and </w:t>
       </w:r>
       <w:proofErr w:type="gramStart"/>
       <w:r>
@@ -205,21 +193,7 @@
           <w:b/>
           <w:bCs/>
         </w:rPr>
-        <w:t>Would you say that the model su</w:t>
-      </w:r>
-      <w:r>
-        <w:rPr>
-          <w:b/>
-          <w:bCs/>
-        </w:rPr>
-        <w:t>ffe</w:t>
-      </w:r>
-      <w:r>
-        <w:rPr>
-          <w:b/>
-          <w:bCs/>
-        </w:rPr>
-        <w:t xml:space="preserve">rs from high bias or high variance? </w:t>
+        <w:t xml:space="preserve">Would you say that the model suffers from high bias or high variance? </w:t>
       </w:r>
     </w:p>
     <w:p>
@@ -343,21 +317,7 @@
           <w:b/>
           <w:bCs/>
         </w:rPr>
-        <w:t>Should you implement two logistic regression classi</w:t>
-      </w:r>
-      <w:r>
-        <w:rPr>
-          <w:b/>
-          <w:bCs/>
-        </w:rPr>
-        <w:t>fi</w:t>
-      </w:r>
-      <w:r>
-        <w:rPr>
-          <w:b/>
-          <w:bCs/>
-        </w:rPr>
-        <w:t xml:space="preserve">ers or one </w:t>
+        <w:t xml:space="preserve">Should you implement two logistic regression classifiers or one </w:t>
       </w:r>
       <w:proofErr w:type="spellStart"/>
       <w:r>
@@ -373,21 +333,7 @@
           <w:b/>
           <w:bCs/>
         </w:rPr>
-        <w:t xml:space="preserve"> regression classi</w:t>
-      </w:r>
-      <w:r>
-        <w:rPr>
-          <w:b/>
-          <w:bCs/>
-        </w:rPr>
-        <w:t>fi</w:t>
-      </w:r>
-      <w:r>
-        <w:rPr>
-          <w:b/>
-          <w:bCs/>
-        </w:rPr>
-        <w:t>er?</w:t>
+        <w:t xml:space="preserve"> regression classifier?</w:t>
       </w:r>
     </w:p>
     <w:p>
@@ -1033,6 +979,7 @@
   <w:style w:type="character" w:default="1" w:styleId="DefaultParagraphFont">
     <w:name w:val="Default Paragraph Font"/>
     <w:uiPriority w:val="1"/>
+    <w:semiHidden/>
     <w:unhideWhenUsed/>
   </w:style>
   <w:style w:type="table" w:default="1" w:styleId="TableNormal">

</xml_diff>